<commit_message>
fix: cleanse Delhi Metro and metropolitan misnomers to authentic PPAC Delhi benchmarks
</commit_message>
<xml_diff>
--- a/output_artifacts/2026-08/PPAC_Ready_Reckoner_2026-08_Draft.docx
+++ b/output_artifacts/2026-08/PPAC_Ready_Reckoner_2026-08_Draft.docx
@@ -89,7 +89,7 @@
               <w:t>Instructions: Pipeline completed with 1 active anomalies (1 CRITICAL, 0 WARNING). Review and resolve each item below. Remove this section prior to statutory release.</w:t>
               <w:br/>
               <w:br/>
-              <w:t xml:space="preserve"> [ ] FLAG-B37138 | 🔴 CRITICAL | Entity: BPCL | Metric: Domestic LPG Sales</w:t>
+              <w:t xml:space="preserve"> [ ] FLAG-84AECD | 🔴 CRITICAL | Entity: BPCL | Metric: Domestic LPG Sales</w:t>
               <w:br/>
               <w:t xml:space="preserve">     • Issue: Ingested 1,100.0 TMT (+69.2% vs baseline). Expected: 585.0 to 715.0 TMT.</w:t>
               <w:br/>
@@ -1288,7 +1288,7 @@
           <w:color w:val="1F4E79"/>
           <w:sz w:val="26"/>
         </w:rPr>
-        <w:t>Chapter 7: Retail Selling Price (RSP) Build-up in Delhi Metro</w:t>
+        <w:t>Chapter 7: Retail Selling Price (RSP) Build-up at Delhi</w:t>
       </w:r>
     </w:p>
     <w:p>

</xml_diff>